<commit_message>
add end line point attaching to diagonal or axes
</commit_message>
<xml_diff>
--- a/doc/PozadavkyPGRF1_Task2_2026.docx
+++ b/doc/PozadavkyPGRF1_Task2_2026.docx
@@ -376,6 +376,15 @@
                 <w:lang w:eastAsia="cs-CZ"/>
               </w:rPr>
             </w:pPr>
+            <w:r>
+              <w:rPr>
+                <w:rFonts w:ascii="Arial" w:eastAsia="Times New Roman" w:hAnsi="Arial" w:cs="Arial"/>
+                <w:sz w:val="20"/>
+                <w:szCs w:val="24"/>
+                <w:lang w:eastAsia="cs-CZ"/>
+              </w:rPr>
+              <w:t>100</w:t>
+            </w:r>
           </w:p>
         </w:tc>
         <w:tc>
@@ -481,6 +490,15 @@
                 <w:lang w:eastAsia="cs-CZ"/>
               </w:rPr>
             </w:pPr>
+            <w:r>
+              <w:rPr>
+                <w:rFonts w:ascii="Arial" w:eastAsia="Times New Roman" w:hAnsi="Arial" w:cs="Arial"/>
+                <w:sz w:val="20"/>
+                <w:szCs w:val="24"/>
+                <w:lang w:eastAsia="cs-CZ"/>
+              </w:rPr>
+              <w:t>100</w:t>
+            </w:r>
           </w:p>
         </w:tc>
         <w:tc>
@@ -587,6 +605,15 @@
                 <w:lang w:eastAsia="cs-CZ"/>
               </w:rPr>
             </w:pPr>
+            <w:r>
+              <w:rPr>
+                <w:rFonts w:ascii="Arial" w:eastAsia="Times New Roman" w:hAnsi="Arial" w:cs="Arial"/>
+                <w:sz w:val="20"/>
+                <w:szCs w:val="24"/>
+                <w:lang w:eastAsia="cs-CZ"/>
+              </w:rPr>
+              <w:t>100</w:t>
+            </w:r>
           </w:p>
         </w:tc>
         <w:tc>
@@ -692,6 +719,15 @@
                 <w:lang w:eastAsia="cs-CZ"/>
               </w:rPr>
             </w:pPr>
+            <w:r>
+              <w:rPr>
+                <w:rFonts w:ascii="Arial" w:eastAsia="Times New Roman" w:hAnsi="Arial" w:cs="Arial"/>
+                <w:sz w:val="20"/>
+                <w:szCs w:val="24"/>
+                <w:lang w:eastAsia="cs-CZ"/>
+              </w:rPr>
+              <w:t>100</w:t>
+            </w:r>
           </w:p>
         </w:tc>
         <w:tc>
@@ -840,7 +876,7 @@
                 <w:sz w:val="20"/>
                 <w:szCs w:val="24"/>
                 <w:highlight w:val="yellow"/>
-                <w:lang w:eastAsia="cs-CZ"/>
+                <w:lang w:val="en-US" w:eastAsia="cs-CZ"/>
               </w:rPr>
             </w:pPr>
           </w:p>
@@ -4157,16 +4193,16 @@
                 <w:szCs w:val="20"/>
                 <w:lang w:eastAsia="cs-CZ"/>
               </w:rPr>
-              <w:t>Konzultace návrhů řešení, získání informací ohledně konkrétních Java knihoven a jejich použití</w:t>
-            </w:r>
-            <w:r>
-              <w:rPr>
-                <w:rFonts w:ascii="Times New Roman" w:eastAsia="Times New Roman" w:hAnsi="Times New Roman" w:cs="Times New Roman"/>
-                <w:sz w:val="20"/>
-                <w:szCs w:val="20"/>
-                <w:lang w:eastAsia="cs-CZ"/>
-              </w:rPr>
-              <w:t>, vygenerování unit testů pro ukotvení funkcionality</w:t>
+              <w:t>Konzultace návrhů řešení, získání informací ohledně konkrétních Java knihoven a jejich použití, vygenerování unit testů pro ukotvení funkcionality</w:t>
+            </w:r>
+            <w:r>
+              <w:rPr>
+                <w:rFonts w:ascii="Times New Roman" w:eastAsia="Times New Roman" w:hAnsi="Times New Roman" w:cs="Times New Roman"/>
+                <w:sz w:val="20"/>
+                <w:szCs w:val="20"/>
+                <w:lang w:eastAsia="cs-CZ"/>
+              </w:rPr>
+              <w:t>, generování vizualizací jednotlivých algoritmů pro lepší pochopení jejich fungování</w:t>
             </w:r>
           </w:p>
         </w:tc>
@@ -4361,27 +4397,8 @@
         <w:rFonts w:ascii="Arial" w:hAnsi="Arial" w:cs="Arial"/>
         <w:b/>
         <w:bCs/>
-        <w:highlight w:val="yellow"/>
       </w:rPr>
-      <w:t>Jméno a Příjm</w:t>
-    </w:r>
-    <w:r>
-      <w:rPr>
-        <w:rFonts w:ascii="Arial" w:hAnsi="Arial" w:cs="Arial"/>
-        <w:b/>
-        <w:bCs/>
-        <w:highlight w:val="yellow"/>
-      </w:rPr>
-      <w:t>e</w:t>
-    </w:r>
-    <w:r>
-      <w:rPr>
-        <w:rFonts w:ascii="Arial" w:hAnsi="Arial" w:cs="Arial"/>
-        <w:b/>
-        <w:bCs/>
-        <w:highlight w:val="yellow"/>
-      </w:rPr>
-      <w:t>ní</w:t>
+      <w:t>Jaroslav Němec</w:t>
     </w:r>
     <w:r>
       <w:rPr>
@@ -4389,7 +4406,15 @@
         <w:b/>
         <w:bCs/>
       </w:rPr>
-      <w:t>, cvičení</w:t>
+      <w:t xml:space="preserve">, </w:t>
+    </w:r>
+    <w:r>
+      <w:rPr>
+        <w:rFonts w:ascii="Arial" w:hAnsi="Arial" w:cs="Arial"/>
+        <w:b/>
+        <w:bCs/>
+      </w:rPr>
+      <w:t>c01</w:t>
     </w:r>
   </w:p>
   <w:p>

</xml_diff>